<commit_message>
Rootworks backup: 2026-08-05 19:11:32
</commit_message>
<xml_diff>
--- a/Clients/Piper AI/Shared/Email Sequences/2026-08-05 US GC-CMAR Feedback/Piper AI - Decision Makers Feedback - 2026-08-05.docx
+++ b/Clients/Piper AI/Shared/Email Sequences/2026-08-05 US GC-CMAR Feedback/Piper AI - Decision Makers Feedback - 2026-08-05.docx
@@ -2,7 +2,7 @@
 <file path=word/document.xml><?xml version="1.0" encoding="utf-8"?>
 <w:document xmlns:w="http://schemas.openxmlformats.org/wordprocessingml/2006/main" xmlns:m="http://schemas.openxmlformats.org/officeDocument/2006/math" xmlns:r="http://schemas.openxmlformats.org/officeDocument/2006/relationships" xmlns:o="urn:schemas-microsoft-com:office:office" xmlns:v="urn:schemas-microsoft-com:vml" xmlns:w10="urn:schemas-microsoft-com:office:word" xmlns:a="http://schemas.openxmlformats.org/drawingml/2006/main" xmlns:pic="http://schemas.openxmlformats.org/drawingml/2006/picture" xmlns:wp="http://schemas.openxmlformats.org/drawingml/2006/wordprocessingDrawing">
   <w:body>
-    <w:bookmarkStart w:id="14" w:name="X3338a98d09569225fbe7222179ffb9d0029890c"/>
+    <w:bookmarkStart w:id="16" w:name="X3338a98d09569225fbe7222179ffb9d0029890c"/>
     <w:p>
       <w:pPr>
         <w:pStyle w:val="Heading1"/>
@@ -62,12 +62,152 @@
         <w:t xml:space="preserve"> </w:t>
       </w:r>
       <w:r>
-        <w:t xml:space="preserve">2 touches. Two variants on the first email, one follow-up.</w:t>
-      </w:r>
-    </w:p>
-    <w:p>
-      <w:pPr>
-        <w:pStyle w:val="BodyText"/>
+        <w:t xml:space="preserve">2 touches. Four variants on the first email, one follow-up.</w:t>
+      </w:r>
+    </w:p>
+    <w:p>
+      <w:pPr>
+        <w:pStyle w:val="BodyText"/>
+      </w:pPr>
+      <w:r>
+        <w:rPr>
+          <w:b/>
+          <w:bCs/>
+        </w:rPr>
+        <w:t xml:space="preserve">What the four variants test.</w:t>
+      </w:r>
+      <w:r>
+        <w:t xml:space="preserve"> </w:t>
+      </w:r>
+      <w:r>
+        <w:t xml:space="preserve">Two different bodies, each sent under two different subject lines, so we can tell a subject-line effect apart from a body effect.</w:t>
+      </w:r>
+    </w:p>
+    <w:p>
+      <w:pPr>
+        <w:pStyle w:val="Compact"/>
+        <w:numPr>
+          <w:ilvl w:val="0"/>
+          <w:numId w:val="1001"/>
+        </w:numPr>
+      </w:pPr>
+      <w:r>
+        <w:rPr>
+          <w:b/>
+          <w:bCs/>
+        </w:rPr>
+        <w:t xml:space="preserve">Body A</w:t>
+      </w:r>
+      <w:r>
+        <w:t xml:space="preserve"> </w:t>
+      </w:r>
+      <w:r>
+        <w:t xml:space="preserve">—</w:t>
+      </w:r>
+      <w:r>
+        <w:t xml:space="preserve"> </w:t>
+      </w:r>
+      <w:r>
+        <w:t xml:space="preserve">“get more specific under pressure”</w:t>
+      </w:r>
+      <w:r>
+        <w:t xml:space="preserve">, and calls it an</w:t>
+      </w:r>
+      <w:r>
+        <w:t xml:space="preserve"> </w:t>
+      </w:r>
+      <w:r>
+        <w:rPr>
+          <w:i/>
+          <w:iCs/>
+        </w:rPr>
+        <w:t xml:space="preserve">AI</w:t>
+      </w:r>
+      <w:r>
+        <w:t xml:space="preserve"> </w:t>
+      </w:r>
+      <w:r>
+        <w:t xml:space="preserve">operating system.</w:t>
+      </w:r>
+    </w:p>
+    <w:p>
+      <w:pPr>
+        <w:pStyle w:val="Compact"/>
+        <w:numPr>
+          <w:ilvl w:val="0"/>
+          <w:numId w:val="1001"/>
+        </w:numPr>
+      </w:pPr>
+      <w:r>
+        <w:rPr>
+          <w:b/>
+          <w:bCs/>
+        </w:rPr>
+        <w:t xml:space="preserve">Body B</w:t>
+      </w:r>
+      <w:r>
+        <w:t xml:space="preserve"> </w:t>
+      </w:r>
+      <w:r>
+        <w:t xml:space="preserve">—</w:t>
+      </w:r>
+      <w:r>
+        <w:t xml:space="preserve"> </w:t>
+      </w:r>
+      <w:r>
+        <w:t xml:space="preserve">“supercharges your estimating team”</w:t>
+      </w:r>
+      <w:r>
+        <w:t xml:space="preserve">, and calls it an operating system, no AI.</w:t>
+      </w:r>
+    </w:p>
+    <w:p>
+      <w:pPr>
+        <w:pStyle w:val="Compact"/>
+        <w:numPr>
+          <w:ilvl w:val="0"/>
+          <w:numId w:val="1001"/>
+        </w:numPr>
+      </w:pPr>
+      <w:r>
+        <w:rPr>
+          <w:b/>
+          <w:bCs/>
+        </w:rPr>
+        <w:t xml:space="preserve">Subject A</w:t>
+      </w:r>
+      <w:r>
+        <w:t xml:space="preserve"> </w:t>
+      </w:r>
+      <w:r>
+        <w:t xml:space="preserve">— your take {{first_name}}</w:t>
+      </w:r>
+    </w:p>
+    <w:p>
+      <w:pPr>
+        <w:pStyle w:val="Compact"/>
+        <w:numPr>
+          <w:ilvl w:val="0"/>
+          <w:numId w:val="1001"/>
+        </w:numPr>
+      </w:pPr>
+      <w:r>
+        <w:rPr>
+          <w:b/>
+          <w:bCs/>
+        </w:rPr>
+        <w:t xml:space="preserve">Subject B</w:t>
+      </w:r>
+      <w:r>
+        <w:t xml:space="preserve"> </w:t>
+      </w:r>
+      <w:r>
+        <w:t xml:space="preserve">— built something for precon teams</w:t>
+      </w:r>
+    </w:p>
+    <w:p>
+      <w:pPr>
+        <w:pStyle w:val="FirstParagraph"/>
       </w:pPr>
       <w:r>
         <w:rPr>
@@ -114,13 +254,13 @@
         </w:pict>
       </w:r>
     </w:p>
-    <w:bookmarkStart w:id="9" w:name="email-1-variant-a"/>
+    <w:bookmarkStart w:id="9" w:name="email-1-variant-a-body-a-subject-a"/>
     <w:p>
       <w:pPr>
         <w:pStyle w:val="Heading2"/>
       </w:pPr>
       <w:r>
-        <w:t xml:space="preserve">Email 1 — variant A</w:t>
+        <w:t xml:space="preserve">Email 1 — variant A (body A · subject A)</w:t>
       </w:r>
     </w:p>
     <w:p>
@@ -154,7 +294,7 @@
         <w:pStyle w:val="BodyText"/>
       </w:pPr>
       <w:r>
-        <w:t xml:space="preserve">We raised money to build the first ever operating system for preconstruction teams.</w:t>
+        <w:t xml:space="preserve">We raised from the most respected fund in the world, the one behind Airbnb and Instagram, to build the first ever AI operating system for preconstruction teams.</w:t>
       </w:r>
     </w:p>
     <w:p>
@@ -189,13 +329,13 @@
       </w:r>
     </w:p>
     <w:bookmarkEnd w:id="9"/>
-    <w:bookmarkStart w:id="10" w:name="email-1-variant-b"/>
+    <w:bookmarkStart w:id="10" w:name="email-1-variant-b-body-b-subject-b"/>
     <w:p>
       <w:pPr>
         <w:pStyle w:val="Heading2"/>
       </w:pPr>
       <w:r>
-        <w:t xml:space="preserve">Email 1 — variant B</w:t>
+        <w:t xml:space="preserve">Email 1 — variant B (body B · subject B)</w:t>
       </w:r>
     </w:p>
     <w:p>
@@ -229,15 +369,15 @@
         <w:pStyle w:val="BodyText"/>
       </w:pPr>
       <w:r>
-        <w:t xml:space="preserve">We raised money to build an end to end operating system for pre-con teams.</w:t>
-      </w:r>
-    </w:p>
-    <w:p>
-      <w:pPr>
-        <w:pStyle w:val="BodyText"/>
-      </w:pPr>
-      <w:r>
-        <w:t xml:space="preserve">It helps scale bid volume, cut manual rework, raise win rate, and break into new bid sources, all without adding headcount.</w:t>
+        <w:t xml:space="preserve">We raised from the fund behind Airbnb and Instagram to build the first ever operating system for pre-con teams.</w:t>
+      </w:r>
+    </w:p>
+    <w:p>
+      <w:pPr>
+        <w:pStyle w:val="BodyText"/>
+      </w:pPr>
+      <w:r>
+        <w:t xml:space="preserve">We built something that supercharges your estimating team, scaling bid volume and raising win rate without adding headcount.</w:t>
       </w:r>
     </w:p>
     <w:p>
@@ -264,108 +404,71 @@
       </w:r>
     </w:p>
     <w:bookmarkEnd w:id="10"/>
-    <w:bookmarkStart w:id="11" w:name="email-2-follow-up"/>
+    <w:bookmarkStart w:id="11" w:name="email-1-variant-c-body-a-subject-b"/>
     <w:p>
       <w:pPr>
         <w:pStyle w:val="Heading2"/>
       </w:pPr>
       <w:r>
-        <w:t xml:space="preserve">Email 2 — follow-up</w:t>
+        <w:t xml:space="preserve">Email 1 — variant C (body A · subject B)</w:t>
       </w:r>
     </w:p>
     <w:p>
       <w:pPr>
         <w:pStyle w:val="FirstParagraph"/>
       </w:pPr>
-      <w:r>
-        <w:t xml:space="preserve">Sent in the same thread, two days later. No new subject line.</w:t>
-      </w:r>
-    </w:p>
-    <w:p>
-      <w:pPr>
-        <w:pStyle w:val="BodyText"/>
-      </w:pPr>
-      <w:r>
-        <w:t xml:space="preserve">I can record a quick walkthrough for you if you prefer.</w:t>
-      </w:r>
-    </w:p>
-    <w:p>
-      <w:pPr>
-        <w:pStyle w:val="BodyText"/>
-      </w:pPr>
-      <w:r>
-        <w:t xml:space="preserve">A team we just ran a pilot with reached incredible results. Around 50 hours a month hunting bids is gone, and two people on their precon desk now do what used to take ten.</w:t>
-      </w:r>
-    </w:p>
-    <w:p>
-      <w:pPr>
-        <w:pStyle w:val="BodyText"/>
-      </w:pPr>
-      <w:r>
-        <w:t xml:space="preserve">I’m positive it will impress you.</w:t>
-      </w:r>
-    </w:p>
-    <w:p>
-      <w:pPr>
-        <w:pStyle w:val="BodyText"/>
-      </w:pPr>
-      <w:r>
-        <w:t xml:space="preserve">Let me know what you think.</w:t>
-      </w:r>
-    </w:p>
-    <w:p>
-      <w:r>
-        <w:pict>
-          <v:rect style="width:0;height:1.5pt" o:hralign="center" o:hrstd="t" o:hr="t"/>
-        </w:pict>
-      </w:r>
-    </w:p>
-    <w:bookmarkEnd w:id="11"/>
-    <w:bookmarkStart w:id="12" w:name="X926a9bd68d47016e501b1778d9ad7564983efb5"/>
-    <w:p>
-      <w:pPr>
-        <w:pStyle w:val="Heading2"/>
-      </w:pPr>
-      <w:r>
-        <w:t xml:space="preserve">Example of the personalisation in context</w:t>
-      </w:r>
-    </w:p>
-    <w:p>
-      <w:pPr>
-        <w:pStyle w:val="FirstParagraph"/>
-      </w:pPr>
-      <w:r>
-        <w:rPr>
-          <w:rStyle w:val="VerbatimChar"/>
-        </w:rPr>
-        <w:t xml:space="preserve">{{authority_line}}</w:t>
-      </w:r>
-      <w:r>
-        <w:t xml:space="preserve"> </w:t>
-      </w:r>
-      <w:r>
-        <w:t xml:space="preserve">for a Director of Construction at a general contractor doing luxury retail work reads:</w:t>
-      </w:r>
-    </w:p>
-    <w:p>
-      <w:pPr>
-        <w:pStyle w:val="BlockText"/>
-      </w:pPr>
-      <w:r>
-        <w:t xml:space="preserve">Given the fact that</w:t>
-      </w:r>
-      <w:r>
-        <w:t xml:space="preserve"> </w:t>
-      </w:r>
       <w:r>
         <w:rPr>
           <w:b/>
           <w:bCs/>
         </w:rPr>
-        <w:t xml:space="preserve">you and your team shape which luxury retail jobs get pursued</w:t>
-      </w:r>
-      <w:r>
-        <w:t xml:space="preserve">, you’d know fast whether this is useful or nonsense.</w:t>
+        <w:t xml:space="preserve">Subject:</w:t>
+      </w:r>
+      <w:r>
+        <w:t xml:space="preserve"> </w:t>
+      </w:r>
+      <w:r>
+        <w:t xml:space="preserve">built something for precon teams</w:t>
+      </w:r>
+    </w:p>
+    <w:p>
+      <w:pPr>
+        <w:pStyle w:val="BodyText"/>
+      </w:pPr>
+      <w:r>
+        <w:t xml:space="preserve">{{first_name}},</w:t>
+      </w:r>
+    </w:p>
+    <w:p>
+      <w:pPr>
+        <w:pStyle w:val="BodyText"/>
+      </w:pPr>
+      <w:r>
+        <w:t xml:space="preserve">We raised from the most respected fund in the world, the one behind Airbnb and Instagram, to build the first ever AI operating system for preconstruction teams.</w:t>
+      </w:r>
+    </w:p>
+    <w:p>
+      <w:pPr>
+        <w:pStyle w:val="BodyText"/>
+      </w:pPr>
+      <w:r>
+        <w:t xml:space="preserve">It enables growth-driven general contractors to get more specific under pressure without adding headcount.</w:t>
+      </w:r>
+    </w:p>
+    <w:p>
+      <w:pPr>
+        <w:pStyle w:val="BodyText"/>
+      </w:pPr>
+      <w:r>
+        <w:t xml:space="preserve">Given the fact that {{authority_line}}, you’d know fast whether this is useful or nonsense.</w:t>
+      </w:r>
+    </w:p>
+    <w:p>
+      <w:pPr>
+        <w:pStyle w:val="BodyText"/>
+      </w:pPr>
+      <w:r>
+        <w:t xml:space="preserve">Would appreciate your blunt take if you’re open to it.</w:t>
       </w:r>
     </w:p>
     <w:p>
@@ -375,14 +478,89 @@
         </w:pict>
       </w:r>
     </w:p>
+    <w:bookmarkEnd w:id="11"/>
+    <w:bookmarkStart w:id="12" w:name="email-1-variant-d-body-b-subject-a"/>
+    <w:p>
+      <w:pPr>
+        <w:pStyle w:val="Heading2"/>
+      </w:pPr>
+      <w:r>
+        <w:t xml:space="preserve">Email 1 — variant D (body B · subject A)</w:t>
+      </w:r>
+    </w:p>
+    <w:p>
+      <w:pPr>
+        <w:pStyle w:val="FirstParagraph"/>
+      </w:pPr>
+      <w:r>
+        <w:rPr>
+          <w:b/>
+          <w:bCs/>
+        </w:rPr>
+        <w:t xml:space="preserve">Subject:</w:t>
+      </w:r>
+      <w:r>
+        <w:t xml:space="preserve"> </w:t>
+      </w:r>
+      <w:r>
+        <w:t xml:space="preserve">your take {{first_name}}</w:t>
+      </w:r>
+    </w:p>
+    <w:p>
+      <w:pPr>
+        <w:pStyle w:val="BodyText"/>
+      </w:pPr>
+      <w:r>
+        <w:t xml:space="preserve">Hey {{first_name}},</w:t>
+      </w:r>
+    </w:p>
+    <w:p>
+      <w:pPr>
+        <w:pStyle w:val="BodyText"/>
+      </w:pPr>
+      <w:r>
+        <w:t xml:space="preserve">We raised from the fund behind Airbnb and Instagram to build the first ever operating system for pre-con teams.</w:t>
+      </w:r>
+    </w:p>
+    <w:p>
+      <w:pPr>
+        <w:pStyle w:val="BodyText"/>
+      </w:pPr>
+      <w:r>
+        <w:t xml:space="preserve">We built something that supercharges your estimating team, scaling bid volume and raising win rate without adding headcount.</w:t>
+      </w:r>
+    </w:p>
+    <w:p>
+      <w:pPr>
+        <w:pStyle w:val="BodyText"/>
+      </w:pPr>
+      <w:r>
+        <w:t xml:space="preserve">Given the fact that {{authority_line}}, your read on this would be worth more than most.</w:t>
+      </w:r>
+    </w:p>
+    <w:p>
+      <w:pPr>
+        <w:pStyle w:val="BodyText"/>
+      </w:pPr>
+      <w:r>
+        <w:t xml:space="preserve">Open to giving us your honest take?</w:t>
+      </w:r>
+    </w:p>
+    <w:p>
+      <w:r>
+        <w:pict>
+          <v:rect style="width:0;height:1.5pt" o:hralign="center" o:hrstd="t" o:hr="t"/>
+        </w:pict>
+      </w:r>
+    </w:p>
     <w:bookmarkEnd w:id="12"/>
-    <w:bookmarkStart w:id="13" w:name="one-thing-to-confirm"/>
+    <w:bookmarkStart w:id="13" w:name="email-2-follow-up"/>
     <w:p>
       <w:pPr>
         <w:pStyle w:val="Heading2"/>
       </w:pPr>
       <w:r>
-        <w:t xml:space="preserve">One thing to confirm</w:t>
+        <w:t xml:space="preserve">Email 2 — follow-up</w:t>
       </w:r>
     </w:p>
     <w:p>
@@ -390,11 +568,122 @@
         <w:pStyle w:val="FirstParagraph"/>
       </w:pPr>
       <w:r>
+        <w:t xml:space="preserve">Sent in the same thread, two days later. No new subject line.</w:t>
+      </w:r>
+    </w:p>
+    <w:p>
+      <w:pPr>
+        <w:pStyle w:val="BodyText"/>
+      </w:pPr>
+      <w:r>
+        <w:t xml:space="preserve">I can record a quick walkthrough for you if you prefer.</w:t>
+      </w:r>
+    </w:p>
+    <w:p>
+      <w:pPr>
+        <w:pStyle w:val="BodyText"/>
+      </w:pPr>
+      <w:r>
+        <w:t xml:space="preserve">A team we just ran a pilot with reached incredible results. Around 50 hours a month hunting bids is gone, and two people on their precon desk now do what used to take ten.</w:t>
+      </w:r>
+    </w:p>
+    <w:p>
+      <w:pPr>
+        <w:pStyle w:val="BodyText"/>
+      </w:pPr>
+      <w:r>
+        <w:t xml:space="preserve">I’m positive it will impress you.</w:t>
+      </w:r>
+    </w:p>
+    <w:p>
+      <w:pPr>
+        <w:pStyle w:val="BodyText"/>
+      </w:pPr>
+      <w:r>
+        <w:t xml:space="preserve">Let me know what you think.</w:t>
+      </w:r>
+    </w:p>
+    <w:p>
+      <w:r>
+        <w:pict>
+          <v:rect style="width:0;height:1.5pt" o:hralign="center" o:hrstd="t" o:hr="t"/>
+        </w:pict>
+      </w:r>
+    </w:p>
+    <w:bookmarkEnd w:id="13"/>
+    <w:bookmarkStart w:id="14" w:name="X926a9bd68d47016e501b1778d9ad7564983efb5"/>
+    <w:p>
+      <w:pPr>
+        <w:pStyle w:val="Heading2"/>
+      </w:pPr>
+      <w:r>
+        <w:t xml:space="preserve">Example of the personalisation in context</w:t>
+      </w:r>
+    </w:p>
+    <w:p>
+      <w:pPr>
+        <w:pStyle w:val="BlockText"/>
+      </w:pPr>
+      <w:r>
+        <w:t xml:space="preserve">Given the fact that</w:t>
+      </w:r>
+      <w:r>
+        <w:t xml:space="preserve"> </w:t>
+      </w:r>
+      <w:r>
+        <w:rPr>
+          <w:b/>
+          <w:bCs/>
+        </w:rPr>
+        <w:t xml:space="preserve">you and your team shape which facility projects Kroeschell pursues</w:t>
+      </w:r>
+      <w:r>
+        <w:t xml:space="preserve">, you’d know fast whether this is useful or nonsense.</w:t>
+      </w:r>
+    </w:p>
+    <w:p>
+      <w:r>
+        <w:pict>
+          <v:rect style="width:0;height:1.5pt" o:hralign="center" o:hrstd="t" o:hr="t"/>
+        </w:pict>
+      </w:r>
+    </w:p>
+    <w:bookmarkEnd w:id="14"/>
+    <w:bookmarkStart w:id="15" w:name="two-things-to-confirm"/>
+    <w:p>
+      <w:pPr>
+        <w:pStyle w:val="Heading2"/>
+      </w:pPr>
+      <w:r>
+        <w:t xml:space="preserve">Two things to confirm</w:t>
+      </w:r>
+    </w:p>
+    <w:p>
+      <w:pPr>
+        <w:pStyle w:val="Compact"/>
+        <w:numPr>
+          <w:ilvl w:val="0"/>
+          <w:numId w:val="1002"/>
+        </w:numPr>
+      </w:pPr>
+      <w:r>
         <w:t xml:space="preserve">The follow-up offers to record a short walkthrough on request. Please confirm Roi is happy to record these when someone asks — the email should not promise it otherwise.</w:t>
       </w:r>
     </w:p>
-    <w:bookmarkEnd w:id="13"/>
-    <w:bookmarkEnd w:id="14"/>
+    <w:p>
+      <w:pPr>
+        <w:pStyle w:val="Compact"/>
+        <w:numPr>
+          <w:ilvl w:val="0"/>
+          <w:numId w:val="1002"/>
+        </w:numPr>
+      </w:pPr>
+      <w:r>
+        <w:t xml:space="preserve">The first line of every variant rests on the fund’s Airbnb and Instagram investments. Please confirm that framing is one you’re comfortable putting in Roi’s name.</w:t>
+      </w:r>
+    </w:p>
+    <w:bookmarkEnd w:id="15"/>
+    <w:bookmarkEnd w:id="16"/>
     <w:sectPr>
       <w:footnotePr>
         <w:numRestart w:val="eachSect"/>
@@ -505,8 +794,229 @@
       </w:pPr>
     </w:lvl>
   </w:abstractNum>
+  <w:abstractNum w:abstractNumId="991">
+    <w:nsid w:val="0000A991"/>
+    <w:multiLevelType w:val="multilevel"/>
+    <w:lvl w:ilvl="0">
+      <w:numFmt w:val="bullet"/>
+      <w:lvlText w:val=""/>
+      <w:lvlJc w:val="left"/>
+      <w:pPr>
+        <w:ind w:left="720" w:hanging="360"/>
+      </w:pPr>
+      <w:rPr>
+        <w:rFonts w:ascii="Symbol" w:hAnsi="Symbol" w:cs="Symbol" w:hint="default"/>
+      </w:rPr>
+    </w:lvl>
+    <w:lvl w:ilvl="1">
+      <w:numFmt w:val="bullet"/>
+      <w:lvlText w:val="o"/>
+      <w:lvlJc w:val="left"/>
+      <w:pPr>
+        <w:ind w:left="1440" w:hanging="360"/>
+      </w:pPr>
+      <w:rPr>
+        <w:rFonts w:ascii="Courier New" w:hAnsi="Courier New" w:cs="Courier New" w:hint="default"/>
+      </w:rPr>
+    </w:lvl>
+    <w:lvl w:ilvl="2">
+      <w:numFmt w:val="bullet"/>
+      <w:lvlText w:val=""/>
+      <w:lvlJc w:val="left"/>
+      <w:pPr>
+        <w:ind w:left="2160" w:hanging="360"/>
+      </w:pPr>
+      <w:rPr>
+        <w:rFonts w:ascii="Wingdings" w:hAnsi="Wingdings" w:cs="Wingdings" w:hint="default"/>
+      </w:rPr>
+    </w:lvl>
+    <w:lvl w:ilvl="3">
+      <w:numFmt w:val="bullet"/>
+      <w:lvlText w:val=""/>
+      <w:lvlJc w:val="left"/>
+      <w:pPr>
+        <w:ind w:left="2880" w:hanging="360"/>
+      </w:pPr>
+      <w:rPr>
+        <w:rFonts w:ascii="Symbol" w:hAnsi="Symbol" w:cs="Symbol" w:hint="default"/>
+      </w:rPr>
+    </w:lvl>
+    <w:lvl w:ilvl="4">
+      <w:numFmt w:val="bullet"/>
+      <w:lvlText w:val="o"/>
+      <w:lvlJc w:val="left"/>
+      <w:pPr>
+        <w:ind w:left="3600" w:hanging="360"/>
+      </w:pPr>
+      <w:rPr>
+        <w:rFonts w:ascii="Courier New" w:hAnsi="Courier New" w:cs="Courier New" w:hint="default"/>
+      </w:rPr>
+    </w:lvl>
+    <w:lvl w:ilvl="5">
+      <w:numFmt w:val="bullet"/>
+      <w:lvlText w:val=""/>
+      <w:lvlJc w:val="left"/>
+      <w:pPr>
+        <w:ind w:left="4320" w:hanging="360"/>
+      </w:pPr>
+      <w:rPr>
+        <w:rFonts w:ascii="Wingdings" w:hAnsi="Wingdings" w:cs="Wingdings" w:hint="default"/>
+      </w:rPr>
+    </w:lvl>
+    <w:lvl w:ilvl="6">
+      <w:numFmt w:val="bullet"/>
+      <w:lvlText w:val=""/>
+      <w:lvlJc w:val="left"/>
+      <w:pPr>
+        <w:ind w:left="5040" w:hanging="360"/>
+      </w:pPr>
+      <w:rPr>
+        <w:rFonts w:ascii="Symbol" w:hAnsi="Symbol" w:cs="Symbol" w:hint="default"/>
+      </w:rPr>
+    </w:lvl>
+    <w:lvl w:ilvl="7">
+      <w:numFmt w:val="bullet"/>
+      <w:lvlText w:val="o"/>
+      <w:lvlJc w:val="left"/>
+      <w:pPr>
+        <w:ind w:left="5760" w:hanging="360"/>
+      </w:pPr>
+      <w:rPr>
+        <w:rFonts w:ascii="Courier New" w:hAnsi="Courier New" w:cs="Courier New" w:hint="default"/>
+      </w:rPr>
+    </w:lvl>
+    <w:lvl w:ilvl="8">
+      <w:numFmt w:val="bullet"/>
+      <w:lvlText w:val=""/>
+      <w:lvlJc w:val="left"/>
+      <w:pPr>
+        <w:ind w:left="6480" w:hanging="360"/>
+      </w:pPr>
+      <w:rPr>
+        <w:rFonts w:ascii="Wingdings" w:hAnsi="Wingdings" w:cs="Wingdings" w:hint="default"/>
+      </w:rPr>
+    </w:lvl>
+  </w:abstractNum>
+  <w:abstractNum w:abstractNumId="99411">
+    <w:nsid w:val="00A99411"/>
+    <w:multiLevelType w:val="multilevel"/>
+    <w:lvl w:ilvl="0">
+      <w:start w:val="1"/>
+      <w:numFmt w:val="decimal"/>
+      <w:lvlText w:val="%1."/>
+      <w:lvlJc w:val="left"/>
+      <w:pPr>
+        <w:ind w:left="720" w:hanging="360"/>
+      </w:pPr>
+    </w:lvl>
+    <w:lvl w:ilvl="1">
+      <w:start w:val="1"/>
+      <w:numFmt w:val="decimal"/>
+      <w:lvlText w:val="%2."/>
+      <w:lvlJc w:val="left"/>
+      <w:pPr>
+        <w:ind w:left="1440" w:hanging="360"/>
+      </w:pPr>
+    </w:lvl>
+    <w:lvl w:ilvl="2">
+      <w:start w:val="1"/>
+      <w:numFmt w:val="decimal"/>
+      <w:lvlText w:val="%3."/>
+      <w:lvlJc w:val="left"/>
+      <w:pPr>
+        <w:ind w:left="2160" w:hanging="360"/>
+      </w:pPr>
+    </w:lvl>
+    <w:lvl w:ilvl="3">
+      <w:start w:val="1"/>
+      <w:numFmt w:val="decimal"/>
+      <w:lvlText w:val="%4."/>
+      <w:lvlJc w:val="left"/>
+      <w:pPr>
+        <w:ind w:left="2880" w:hanging="360"/>
+      </w:pPr>
+    </w:lvl>
+    <w:lvl w:ilvl="4">
+      <w:start w:val="1"/>
+      <w:numFmt w:val="decimal"/>
+      <w:lvlText w:val="%5."/>
+      <w:lvlJc w:val="left"/>
+      <w:pPr>
+        <w:ind w:left="3600" w:hanging="360"/>
+      </w:pPr>
+    </w:lvl>
+    <w:lvl w:ilvl="5">
+      <w:start w:val="1"/>
+      <w:numFmt w:val="decimal"/>
+      <w:lvlText w:val="%6."/>
+      <w:lvlJc w:val="left"/>
+      <w:pPr>
+        <w:ind w:left="4320" w:hanging="360"/>
+      </w:pPr>
+    </w:lvl>
+    <w:lvl w:ilvl="6">
+      <w:start w:val="1"/>
+      <w:numFmt w:val="decimal"/>
+      <w:lvlText w:val="%7."/>
+      <w:lvlJc w:val="left"/>
+      <w:pPr>
+        <w:ind w:left="5040" w:hanging="360"/>
+      </w:pPr>
+    </w:lvl>
+    <w:lvl w:ilvl="7">
+      <w:start w:val="1"/>
+      <w:numFmt w:val="decimal"/>
+      <w:lvlText w:val="%8."/>
+      <w:lvlJc w:val="left"/>
+      <w:pPr>
+        <w:ind w:left="5760" w:hanging="360"/>
+      </w:pPr>
+    </w:lvl>
+    <w:lvl w:ilvl="8">
+      <w:start w:val="1"/>
+      <w:numFmt w:val="decimal"/>
+      <w:lvlText w:val="%9."/>
+      <w:lvlJc w:val="left"/>
+      <w:pPr>
+        <w:ind w:left="6480" w:hanging="360"/>
+      </w:pPr>
+    </w:lvl>
+  </w:abstractNum>
   <w:num w:numId="1000">
     <w:abstractNumId w:val="990"/>
+  </w:num>
+  <w:num w:numId="1001">
+    <w:abstractNumId w:val="991"/>
+  </w:num>
+  <w:num w:numId="1002">
+    <w:abstractNumId w:val="99411"/>
+    <w:lvlOverride w:ilvl="0">
+      <w:startOverride w:val="1"/>
+    </w:lvlOverride>
+    <w:lvlOverride w:ilvl="1">
+      <w:startOverride w:val="1"/>
+    </w:lvlOverride>
+    <w:lvlOverride w:ilvl="2">
+      <w:startOverride w:val="1"/>
+    </w:lvlOverride>
+    <w:lvlOverride w:ilvl="3">
+      <w:startOverride w:val="1"/>
+    </w:lvlOverride>
+    <w:lvlOverride w:ilvl="4">
+      <w:startOverride w:val="1"/>
+    </w:lvlOverride>
+    <w:lvlOverride w:ilvl="5">
+      <w:startOverride w:val="1"/>
+    </w:lvlOverride>
+    <w:lvlOverride w:ilvl="6">
+      <w:startOverride w:val="1"/>
+    </w:lvlOverride>
+    <w:lvlOverride w:ilvl="7">
+      <w:startOverride w:val="1"/>
+    </w:lvlOverride>
+    <w:lvlOverride w:ilvl="8">
+      <w:startOverride w:val="1"/>
+    </w:lvlOverride>
   </w:num>
 </w:numbering>
 </file>

</xml_diff>